<commit_message>
Add Sprint 4 documentation updates
</commit_message>
<xml_diff>
--- a/documentation/meetings/Sprint_4_Meeting_Minutes.docx
+++ b/documentation/meetings/Sprint_4_Meeting_Minutes.docx
@@ -1302,25 +1302,7 @@
           <w:sz w:val="21"/>
           <w:szCs w:val="21"/>
         </w:rPr>
-        <w:t xml:space="preserve">Reviewed the Sprint 3 Retrospective. What went well: the shared foundation finished on Day 1, the common UI design was locked before development, Chart 3 was no longer the critical path, and the burndown stayed on or below </w:t>
-      </w:r>
-      <w:proofErr w:type="gramStart"/>
-      <w:r>
-        <w:rPr>
-          <w:rFonts w:ascii="Calibri" w:hAnsi="Calibri" w:cs="Calibri"/>
-          <w:sz w:val="21"/>
-          <w:szCs w:val="21"/>
-        </w:rPr>
-        <w:t>plan</w:t>
-      </w:r>
-      <w:proofErr w:type="gramEnd"/>
-      <w:r>
-        <w:rPr>
-          <w:rFonts w:ascii="Calibri" w:hAnsi="Calibri" w:cs="Calibri"/>
-          <w:sz w:val="21"/>
-          <w:szCs w:val="21"/>
-        </w:rPr>
-        <w:t xml:space="preserve"> every day. What did not: work was closed unevenly (six tasks on Day 4), the first-pass dashboard only came together on Day 5, shared set-up depended heavily on one member, and interaction consistency could only be checked at the end of the sprint.</w:t>
+        <w:t>Reviewed the Sprint 3 Retrospective. What went well: the shared foundation finished on Day 1, the common UI design was locked before development, Chart 3 was no longer the critical path, and the burndown stayed on or below plan every day. What did not: work was closed unevenly (six tasks on Day 4), the first-pass dashboard only came together on Day 5, shared set-up depended heavily on one member, and interaction consistency could only be checked at the end of the sprint.</w:t>
       </w:r>
     </w:p>
     <w:p>
@@ -1468,25 +1450,7 @@
           <w:sz w:val="21"/>
           <w:szCs w:val="21"/>
         </w:rPr>
-        <w:t xml:space="preserve">Noted that the overarching and three individual research questions remain unchanged from Meeting 01 and Meeting </w:t>
-      </w:r>
-      <w:proofErr w:type="gramStart"/>
-      <w:r>
-        <w:rPr>
-          <w:rFonts w:ascii="Calibri" w:hAnsi="Calibri" w:cs="Calibri"/>
-          <w:sz w:val="21"/>
-          <w:szCs w:val="21"/>
-        </w:rPr>
-        <w:t>02, and</w:t>
-      </w:r>
-      <w:proofErr w:type="gramEnd"/>
-      <w:r>
-        <w:rPr>
-          <w:rFonts w:ascii="Calibri" w:hAnsi="Calibri" w:cs="Calibri"/>
-          <w:sz w:val="21"/>
-          <w:szCs w:val="21"/>
-        </w:rPr>
-        <w:t xml:space="preserve"> will not be revisited during Sprint 4.</w:t>
+        <w:t>Noted that the overarching and three individual research questions remain unchanged from Meeting 01 and Meeting 02, and will not be revisited during Sprint 4.</w:t>
       </w:r>
     </w:p>
     <w:p>
@@ -1509,25 +1473,7 @@
           <w:sz w:val="21"/>
           <w:szCs w:val="21"/>
         </w:rPr>
-        <w:t xml:space="preserve">Discussed keeping GitHub commits and Trello statuses current </w:t>
-      </w:r>
-      <w:proofErr w:type="gramStart"/>
-      <w:r>
-        <w:rPr>
-          <w:rFonts w:ascii="Calibri" w:hAnsi="Calibri" w:cs="Calibri"/>
-          <w:sz w:val="21"/>
-          <w:szCs w:val="21"/>
-        </w:rPr>
-        <w:t>daily, and</w:t>
-      </w:r>
-      <w:proofErr w:type="gramEnd"/>
-      <w:r>
-        <w:rPr>
-          <w:rFonts w:ascii="Calibri" w:hAnsi="Calibri" w:cs="Calibri"/>
-          <w:sz w:val="21"/>
-          <w:szCs w:val="21"/>
-        </w:rPr>
-        <w:t xml:space="preserve"> updating the Sprint 4 burndown each day from the actual Trello checklist count, given three members integrating into one shared codebase.</w:t>
+        <w:t>Discussed keeping GitHub commits and Trello statuses current daily, and updating the Sprint 4 burndown each day from the actual Trello checklist count, given three members integrating into one shared codebase.</w:t>
       </w:r>
     </w:p>
     <w:p>
@@ -2267,25 +2213,7 @@
                 <w:sz w:val="18"/>
                 <w:szCs w:val="18"/>
               </w:rPr>
-              <w:t xml:space="preserve">Build closed Day 3; tooltip (daily </w:t>
-            </w:r>
-            <w:proofErr w:type="gramStart"/>
-            <w:r>
-              <w:rPr>
-                <w:rFonts w:ascii="Calibri" w:eastAsia="Calibri" w:hAnsi="Calibri" w:cs="Calibri"/>
-                <w:sz w:val="18"/>
-                <w:szCs w:val="18"/>
-              </w:rPr>
-              <w:t>units</w:t>
-            </w:r>
-            <w:proofErr w:type="gramEnd"/>
-            <w:r>
-              <w:rPr>
-                <w:rFonts w:ascii="Calibri" w:eastAsia="Calibri" w:hAnsi="Calibri" w:cs="Calibri"/>
-                <w:sz w:val="18"/>
-                <w:szCs w:val="18"/>
-              </w:rPr>
-              <w:t>/revenue detail) and drag-to-zoom box-select closed Day 4 (Sprint 3 Burndown; Sprint 3 Backlog).</w:t>
+              <w:t>Build closed Day 3; tooltip (daily units/revenue detail) and drag-to-zoom box-select closed Day 4 (Sprint 3 Burndown; Sprint 3 Backlog).</w:t>
             </w:r>
           </w:p>
         </w:tc>
@@ -3224,25 +3152,7 @@
                 <w:sz w:val="18"/>
                 <w:szCs w:val="18"/>
               </w:rPr>
-              <w:t xml:space="preserve"> = store location. Tooltip shows daily </w:t>
-            </w:r>
-            <w:proofErr w:type="gramStart"/>
-            <w:r>
-              <w:rPr>
-                <w:rFonts w:ascii="Calibri" w:eastAsia="Calibri" w:hAnsi="Calibri" w:cs="Calibri"/>
-                <w:sz w:val="18"/>
-                <w:szCs w:val="18"/>
-              </w:rPr>
-              <w:t>units</w:t>
-            </w:r>
-            <w:proofErr w:type="gramEnd"/>
-            <w:r>
-              <w:rPr>
-                <w:rFonts w:ascii="Calibri" w:eastAsia="Calibri" w:hAnsi="Calibri" w:cs="Calibri"/>
-                <w:sz w:val="18"/>
-                <w:szCs w:val="18"/>
-              </w:rPr>
-              <w:t>/revenue detail; drag to zoom (box-select).</w:t>
+              <w:t xml:space="preserve"> = store location. Tooltip shows daily units/revenue detail; drag to zoom (box-select).</w:t>
             </w:r>
           </w:p>
         </w:tc>
@@ -3498,16 +3408,7 @@
                 <w:sz w:val="18"/>
                 <w:szCs w:val="18"/>
               </w:rPr>
-              <w:t xml:space="preserve">Heat </w:t>
-            </w:r>
-            <w:proofErr w:type="gramStart"/>
-            <w:r>
-              <w:rPr>
-                <w:rFonts w:ascii="Calibri" w:eastAsia="Calibri" w:hAnsi="Calibri" w:cs="Calibri"/>
-                <w:sz w:val="18"/>
-                <w:szCs w:val="18"/>
-              </w:rPr>
-              <w:t xml:space="preserve">map </w:t>
+              <w:t xml:space="preserve">Heat map </w:t>
             </w:r>
             <w:r>
               <w:rPr>
@@ -3523,34 +3424,7 @@
                 <w:sz w:val="18"/>
                 <w:szCs w:val="18"/>
               </w:rPr>
-              <w:t>store</w:t>
-            </w:r>
-            <w:proofErr w:type="gramEnd"/>
-            <w:r>
-              <w:rPr>
-                <w:rFonts w:ascii="Calibri" w:eastAsia="Calibri" w:hAnsi="Calibri" w:cs="Calibri"/>
-                <w:sz w:val="18"/>
-                <w:szCs w:val="18"/>
-              </w:rPr>
-              <w:t xml:space="preserve"> map; scatter plot </w:t>
-            </w:r>
-            <w:proofErr w:type="gramStart"/>
-            <w:r>
-              <w:rPr>
-                <w:rFonts w:ascii="Calibri" w:eastAsia="Calibri" w:hAnsi="Calibri" w:cs="Calibri"/>
-                <w:sz w:val="18"/>
-                <w:szCs w:val="18"/>
-              </w:rPr>
-              <w:t>full-width</w:t>
-            </w:r>
-            <w:proofErr w:type="gramEnd"/>
-            <w:r>
-              <w:rPr>
-                <w:rFonts w:ascii="Calibri" w:eastAsia="Calibri" w:hAnsi="Calibri" w:cs="Calibri"/>
-                <w:sz w:val="18"/>
-                <w:szCs w:val="18"/>
-              </w:rPr>
-              <w:t xml:space="preserve"> below</w:t>
+              <w:t>store map; scatter plot full-width below</w:t>
             </w:r>
             <w:r>
               <w:rPr>
@@ -3977,43 +3851,7 @@
                 <w:sz w:val="18"/>
                 <w:szCs w:val="18"/>
               </w:rPr>
-              <w:t xml:space="preserve">The cream/espresso design </w:t>
-            </w:r>
-            <w:proofErr w:type="gramStart"/>
-            <w:r>
-              <w:rPr>
-                <w:rFonts w:ascii="Calibri" w:eastAsia="Calibri" w:hAnsi="Calibri" w:cs="Calibri"/>
-                <w:sz w:val="18"/>
-                <w:szCs w:val="18"/>
-              </w:rPr>
-              <w:t>carries over</w:t>
-            </w:r>
-            <w:proofErr w:type="gramEnd"/>
-            <w:r>
-              <w:rPr>
-                <w:rFonts w:ascii="Calibri" w:eastAsia="Calibri" w:hAnsi="Calibri" w:cs="Calibri"/>
-                <w:sz w:val="18"/>
-                <w:szCs w:val="18"/>
-              </w:rPr>
-              <w:t xml:space="preserve"> unchanged to the integrated dashboard in both </w:t>
-            </w:r>
-            <w:proofErr w:type="gramStart"/>
-            <w:r>
-              <w:rPr>
-                <w:rFonts w:ascii="Calibri" w:eastAsia="Calibri" w:hAnsi="Calibri" w:cs="Calibri"/>
-                <w:sz w:val="18"/>
-                <w:szCs w:val="18"/>
-              </w:rPr>
-              <w:t>the light</w:t>
-            </w:r>
-            <w:proofErr w:type="gramEnd"/>
-            <w:r>
-              <w:rPr>
-                <w:rFonts w:ascii="Calibri" w:eastAsia="Calibri" w:hAnsi="Calibri" w:cs="Calibri"/>
-                <w:sz w:val="18"/>
-                <w:szCs w:val="18"/>
-              </w:rPr>
-              <w:t xml:space="preserve"> and dark themes.</w:t>
+              <w:t>The cream/espresso design carries over unchanged to the integrated dashboard in both the light and dark themes.</w:t>
             </w:r>
           </w:p>
         </w:tc>
@@ -4378,23 +4216,13 @@
                 <w:szCs w:val="18"/>
               </w:rPr>
             </w:pPr>
-            <w:proofErr w:type="gramStart"/>
-            <w:r>
-              <w:rPr>
-                <w:rFonts w:ascii="Calibri" w:eastAsia="Calibri" w:hAnsi="Calibri" w:cs="Calibri"/>
-                <w:sz w:val="18"/>
-                <w:szCs w:val="18"/>
-              </w:rPr>
-              <w:t>Integrate</w:t>
-            </w:r>
-            <w:proofErr w:type="gramEnd"/>
-            <w:r>
-              <w:rPr>
-                <w:rFonts w:ascii="Calibri" w:eastAsia="Calibri" w:hAnsi="Calibri" w:cs="Calibri"/>
-                <w:sz w:val="18"/>
-                <w:szCs w:val="18"/>
-              </w:rPr>
-              <w:t xml:space="preserve"> Chart 1 (S4-01)</w:t>
+            <w:r>
+              <w:rPr>
+                <w:rFonts w:ascii="Calibri" w:eastAsia="Calibri" w:hAnsi="Calibri" w:cs="Calibri"/>
+                <w:sz w:val="18"/>
+                <w:szCs w:val="18"/>
+              </w:rPr>
+              <w:t>Integrate Chart 1 (S4-01)</w:t>
             </w:r>
           </w:p>
         </w:tc>
@@ -4464,33 +4292,15 @@
                 <w:sz w:val="18"/>
                 <w:szCs w:val="18"/>
               </w:rPr>
-              <w:t xml:space="preserve">D3.js Temporal Heat Map </w:t>
-            </w:r>
-            <w:proofErr w:type="gramStart"/>
-            <w:r>
-              <w:rPr>
-                <w:rFonts w:ascii="Calibri" w:eastAsia="Calibri" w:hAnsi="Calibri" w:cs="Calibri"/>
-                <w:sz w:val="18"/>
-                <w:szCs w:val="18"/>
-              </w:rPr>
-              <w:t xml:space="preserve">running </w:t>
-            </w:r>
-            <w:r>
-              <w:rPr>
-                <w:rFonts w:ascii="Calibri" w:eastAsia="Calibri" w:hAnsi="Calibri" w:cs="Calibri"/>
-                <w:sz w:val="18"/>
-                <w:szCs w:val="18"/>
-              </w:rPr>
-              <w:t xml:space="preserve"> full</w:t>
-            </w:r>
-            <w:proofErr w:type="gramEnd"/>
-            <w:r>
-              <w:rPr>
-                <w:rFonts w:ascii="Calibri" w:eastAsia="Calibri" w:hAnsi="Calibri" w:cs="Calibri"/>
-                <w:sz w:val="18"/>
-                <w:szCs w:val="18"/>
-              </w:rPr>
-              <w:t xml:space="preserve"> width </w:t>
+              <w:t xml:space="preserve">D3.js Temporal Heat Map running </w:t>
+            </w:r>
+            <w:r>
+              <w:rPr>
+                <w:rFonts w:ascii="Calibri" w:eastAsia="Calibri" w:hAnsi="Calibri" w:cs="Calibri"/>
+                <w:sz w:val="18"/>
+                <w:szCs w:val="18"/>
+              </w:rPr>
+              <w:t xml:space="preserve"> full width </w:t>
             </w:r>
             <w:r>
               <w:rPr>
@@ -4800,25 +4610,7 @@
                 <w:sz w:val="18"/>
                 <w:szCs w:val="18"/>
               </w:rPr>
-              <w:t xml:space="preserve">D3.js Scatter Plot running </w:t>
-            </w:r>
-            <w:proofErr w:type="gramStart"/>
-            <w:r>
-              <w:rPr>
-                <w:rFonts w:ascii="Calibri" w:eastAsia="Calibri" w:hAnsi="Calibri" w:cs="Calibri"/>
-                <w:sz w:val="18"/>
-                <w:szCs w:val="18"/>
-              </w:rPr>
-              <w:t>full-width</w:t>
-            </w:r>
-            <w:proofErr w:type="gramEnd"/>
-            <w:r>
-              <w:rPr>
-                <w:rFonts w:ascii="Calibri" w:eastAsia="Calibri" w:hAnsi="Calibri" w:cs="Calibri"/>
-                <w:sz w:val="18"/>
-                <w:szCs w:val="18"/>
-              </w:rPr>
-              <w:t xml:space="preserve"> inside the shared layout on the common dataset</w:t>
+              <w:t>D3.js Scatter Plot running full-width inside the shared layout on the common dataset</w:t>
             </w:r>
           </w:p>
         </w:tc>
@@ -6413,61 +6205,7 @@
           <w:sz w:val="21"/>
           <w:szCs w:val="21"/>
         </w:rPr>
-        <w:t xml:space="preserve">Chart ownership unchanged: Chart 1 (Temporal Heat </w:t>
-      </w:r>
-      <w:proofErr w:type="gramStart"/>
-      <w:r>
-        <w:rPr>
-          <w:rFonts w:ascii="Calibri" w:hAnsi="Calibri" w:cs="Calibri"/>
-          <w:sz w:val="21"/>
-          <w:szCs w:val="21"/>
-        </w:rPr>
-        <w:t>Map) —</w:t>
-      </w:r>
-      <w:proofErr w:type="gramEnd"/>
-      <w:r>
-        <w:rPr>
-          <w:rFonts w:ascii="Calibri" w:hAnsi="Calibri" w:cs="Calibri"/>
-          <w:sz w:val="21"/>
-          <w:szCs w:val="21"/>
-        </w:rPr>
-        <w:t xml:space="preserve"> Samarakoon; Chart 2 (Store Location </w:t>
-      </w:r>
-      <w:proofErr w:type="gramStart"/>
-      <w:r>
-        <w:rPr>
-          <w:rFonts w:ascii="Calibri" w:hAnsi="Calibri" w:cs="Calibri"/>
-          <w:sz w:val="21"/>
-          <w:szCs w:val="21"/>
-        </w:rPr>
-        <w:t>Map) —</w:t>
-      </w:r>
-      <w:proofErr w:type="gramEnd"/>
-      <w:r>
-        <w:rPr>
-          <w:rFonts w:ascii="Calibri" w:hAnsi="Calibri" w:cs="Calibri"/>
-          <w:sz w:val="21"/>
-          <w:szCs w:val="21"/>
-        </w:rPr>
-        <w:t xml:space="preserve"> Ilamperuma; Chart 3 (Scatter </w:t>
-      </w:r>
-      <w:proofErr w:type="gramStart"/>
-      <w:r>
-        <w:rPr>
-          <w:rFonts w:ascii="Calibri" w:hAnsi="Calibri" w:cs="Calibri"/>
-          <w:sz w:val="21"/>
-          <w:szCs w:val="21"/>
-        </w:rPr>
-        <w:t>Plot) —</w:t>
-      </w:r>
-      <w:proofErr w:type="gramEnd"/>
-      <w:r>
-        <w:rPr>
-          <w:rFonts w:ascii="Calibri" w:hAnsi="Calibri" w:cs="Calibri"/>
-          <w:sz w:val="21"/>
-          <w:szCs w:val="21"/>
-        </w:rPr>
-        <w:t xml:space="preserve"> De Silva.</w:t>
+        <w:t>Chart ownership unchanged: Chart 1 (Temporal Heat Map) — Samarakoon; Chart 2 (Store Location Map) — Ilamperuma; Chart 3 (Scatter Plot) — De Silva.</w:t>
       </w:r>
     </w:p>
     <w:p>
@@ -6531,7 +6269,6 @@
         </w:rPr>
         <w:t xml:space="preserve">The integrated dashboard follows the confirmed layout and </w:t>
       </w:r>
-      <w:proofErr w:type="gramStart"/>
       <w:r>
         <w:rPr>
           <w:rFonts w:ascii="Calibri" w:hAnsi="Calibri" w:cs="Calibri"/>
@@ -6540,7 +6277,6 @@
         </w:rPr>
         <w:t>finalized</w:t>
       </w:r>
-      <w:proofErr w:type="gramEnd"/>
       <w:r>
         <w:rPr>
           <w:rFonts w:ascii="Calibri" w:hAnsi="Calibri" w:cs="Calibri"/>
@@ -8475,25 +8211,7 @@
           <w:sz w:val="21"/>
           <w:szCs w:val="21"/>
         </w:rPr>
-        <w:t xml:space="preserve">Meeting 05 will review the integrated dashboard — shared filters, </w:t>
-      </w:r>
-      <w:proofErr w:type="gramStart"/>
-      <w:r>
-        <w:rPr>
-          <w:rFonts w:ascii="Calibri" w:hAnsi="Calibri" w:cs="Calibri"/>
-          <w:sz w:val="21"/>
-          <w:szCs w:val="21"/>
-        </w:rPr>
-        <w:t>Reset</w:t>
-      </w:r>
-      <w:proofErr w:type="gramEnd"/>
-      <w:r>
-        <w:rPr>
-          <w:rFonts w:ascii="Calibri" w:hAnsi="Calibri" w:cs="Calibri"/>
-          <w:sz w:val="21"/>
-          <w:szCs w:val="21"/>
-        </w:rPr>
-        <w:t xml:space="preserve"> button and connected charts — together with the Sprint 4 testing results and bug log, and begin planning the Sprint 5 final website checks: final UI review, ethical review (misleading axes, calculations, data-source attribution and limitations), documentation, and submission preparation.</w:t>
+        <w:t>Meeting 05 will review the integrated dashboard — shared filters, Reset button and connected charts — together with the Sprint 4 testing results and bug log, and begin planning the Sprint 5 final website checks: final UI review, ethical review (misleading axes, calculations, data-source attribution and limitations), documentation, and submission preparation.</w:t>
       </w:r>
     </w:p>
     <w:p>
@@ -8718,16 +8436,7 @@
           <w:szCs w:val="20"/>
         </w:rPr>
         <w:lastRenderedPageBreak/>
-        <w:t xml:space="preserve">Chart 3 — Scatter </w:t>
-      </w:r>
-      <w:proofErr w:type="gramStart"/>
-      <w:r>
-        <w:rPr>
-          <w:color w:val="000000" w:themeColor="text1"/>
-          <w:sz w:val="20"/>
-          <w:szCs w:val="20"/>
-        </w:rPr>
-        <w:t>Plot</w:t>
+        <w:t>Chart 3 — Scatter Plot</w:t>
       </w:r>
       <w:r>
         <w:rPr>
@@ -8738,7 +8447,6 @@
         </w:rPr>
         <w:t>(</w:t>
       </w:r>
-      <w:proofErr w:type="gramEnd"/>
       <w:r>
         <w:rPr>
           <w:rFonts w:ascii="Calibri" w:eastAsia="Calibri" w:hAnsi="Calibri" w:cs="Calibri"/>
@@ -9004,14 +8712,36 @@
           <w:rFonts w:ascii="Calibri" w:hAnsi="Calibri" w:cs="Calibri"/>
         </w:rPr>
         <w:lastRenderedPageBreak/>
-        <w:t>Initial Dashboard</w:t>
+        <w:t xml:space="preserve">Initial </w:t>
       </w:r>
       <w:r>
         <w:rPr>
           <w:rFonts w:ascii="Calibri" w:hAnsi="Calibri" w:cs="Calibri"/>
         </w:rPr>
-        <w:t xml:space="preserve"> </w:t>
+        <w:t>Dashboard</w:t>
       </w:r>
+      <w:r>
+        <w:rPr>
+          <w:rFonts w:ascii="Calibri" w:hAnsi="Calibri" w:cs="Calibri"/>
+        </w:rPr>
+        <w:t xml:space="preserve"> - </w:t>
+      </w:r>
+      <w:hyperlink r:id="rId8" w:history="1">
+        <w:r>
+          <w:rPr>
+            <w:rStyle w:val="Hyperlink"/>
+            <w:rFonts w:ascii="Calibri" w:hAnsi="Calibri" w:cs="Calibri"/>
+          </w:rPr>
+          <w:t>Lin</w:t>
+        </w:r>
+        <w:r>
+          <w:rPr>
+            <w:rStyle w:val="Hyperlink"/>
+            <w:rFonts w:ascii="Calibri" w:hAnsi="Calibri" w:cs="Calibri"/>
+          </w:rPr>
+          <w:t>k</w:t>
+        </w:r>
+      </w:hyperlink>
     </w:p>
     <w:p>
       <w:pPr>
@@ -9023,6 +8753,7 @@
       <w:r>
         <w:rPr>
           <w:rFonts w:ascii="Calibri" w:hAnsi="Calibri" w:cs="Calibri"/>
+          <w:noProof/>
         </w:rPr>
         <w:drawing>
           <wp:inline distT="0" distB="0" distL="0" distR="0" wp14:anchorId="61C3CE3F" wp14:editId="41C26558">
@@ -9040,7 +8771,7 @@
                     <pic:cNvPicPr/>
                   </pic:nvPicPr>
                   <pic:blipFill>
-                    <a:blip r:embed="rId8"/>
+                    <a:blip r:embed="rId9"/>
                     <a:stretch>
                       <a:fillRect/>
                     </a:stretch>
@@ -9768,6 +9499,18 @@
       <w:shd w:val="clear" w:color="auto" w:fill="E1DFDD"/>
     </w:rPr>
   </w:style>
+  <w:style w:type="character" w:styleId="FollowedHyperlink">
+    <w:name w:val="FollowedHyperlink"/>
+    <w:basedOn w:val="DefaultParagraphFont"/>
+    <w:uiPriority w:val="99"/>
+    <w:semiHidden/>
+    <w:unhideWhenUsed/>
+    <w:rsid w:val="00416A06"/>
+    <w:rPr>
+      <w:color w:val="96607D" w:themeColor="followedHyperlink"/>
+      <w:u w:val="single"/>
+    </w:rPr>
+  </w:style>
 </w:styles>
 </file>
 

</xml_diff>

<commit_message>
Update Sprint 3 and Sprint 4 documentation
</commit_message>
<xml_diff>
--- a/documentation/meetings/Sprint_4_Meeting_Minutes.docx
+++ b/documentation/meetings/Sprint_4_Meeting_Minutes.docx
@@ -1300,7 +1300,25 @@
           <w:sz w:val="21"/>
           <w:szCs w:val="21"/>
         </w:rPr>
-        <w:t>Reviewed the Sprint 3 Retrospective. What went well: the shared foundation finished on Day 1, the common UI design was locked before development, Chart 3 was no longer the critical path, and the burndown stayed on or below plan every day. What did not: work was closed unevenly (six tasks on Day 4), the first-pass dashboard only came together on Day 5, shared set-up depended heavily on one member, and interaction consistency could only be checked at the end of the sprint.</w:t>
+        <w:t xml:space="preserve">Reviewed the Sprint 3 Retrospective. What went well: the shared foundation finished on Day 1, the common UI design was locked before development, Chart 3 was no longer the critical path, and the burndown stayed on or below </w:t>
+      </w:r>
+      <w:proofErr w:type="gramStart"/>
+      <w:r>
+        <w:rPr>
+          <w:rFonts w:ascii="Calibri" w:hAnsi="Calibri" w:cs="Calibri"/>
+          <w:sz w:val="21"/>
+          <w:szCs w:val="21"/>
+        </w:rPr>
+        <w:t>plan</w:t>
+      </w:r>
+      <w:proofErr w:type="gramEnd"/>
+      <w:r>
+        <w:rPr>
+          <w:rFonts w:ascii="Calibri" w:hAnsi="Calibri" w:cs="Calibri"/>
+          <w:sz w:val="21"/>
+          <w:szCs w:val="21"/>
+        </w:rPr>
+        <w:t xml:space="preserve"> every day. What did not: work was closed unevenly (six tasks on Day 4), the first-pass dashboard only came together on Day 5, shared set-up depended heavily on one member, and interaction consistency could only be checked at the end of the sprint.</w:t>
       </w:r>
     </w:p>
     <w:p>
@@ -1448,7 +1466,25 @@
           <w:sz w:val="21"/>
           <w:szCs w:val="21"/>
         </w:rPr>
-        <w:t>Noted that the overarching and three individual research questions remain unchanged from Meeting 01 and Meeting 02, and will not be revisited during Sprint 4.</w:t>
+        <w:t xml:space="preserve">Noted that the overarching and three individual research questions remain unchanged from Meeting 01 and Meeting </w:t>
+      </w:r>
+      <w:proofErr w:type="gramStart"/>
+      <w:r>
+        <w:rPr>
+          <w:rFonts w:ascii="Calibri" w:hAnsi="Calibri" w:cs="Calibri"/>
+          <w:sz w:val="21"/>
+          <w:szCs w:val="21"/>
+        </w:rPr>
+        <w:t>02, and</w:t>
+      </w:r>
+      <w:proofErr w:type="gramEnd"/>
+      <w:r>
+        <w:rPr>
+          <w:rFonts w:ascii="Calibri" w:hAnsi="Calibri" w:cs="Calibri"/>
+          <w:sz w:val="21"/>
+          <w:szCs w:val="21"/>
+        </w:rPr>
+        <w:t xml:space="preserve"> will not be revisited during Sprint 4.</w:t>
       </w:r>
     </w:p>
     <w:p>
@@ -1471,7 +1507,25 @@
           <w:sz w:val="21"/>
           <w:szCs w:val="21"/>
         </w:rPr>
-        <w:t>Discussed keeping GitHub commits and Trello statuses current daily, and updating the Sprint 4 burndown each day from the actual Trello checklist count, given three members integrating into one shared codebase.</w:t>
+        <w:t xml:space="preserve">Discussed keeping GitHub commits and Trello statuses current </w:t>
+      </w:r>
+      <w:proofErr w:type="gramStart"/>
+      <w:r>
+        <w:rPr>
+          <w:rFonts w:ascii="Calibri" w:hAnsi="Calibri" w:cs="Calibri"/>
+          <w:sz w:val="21"/>
+          <w:szCs w:val="21"/>
+        </w:rPr>
+        <w:t>daily, and</w:t>
+      </w:r>
+      <w:proofErr w:type="gramEnd"/>
+      <w:r>
+        <w:rPr>
+          <w:rFonts w:ascii="Calibri" w:hAnsi="Calibri" w:cs="Calibri"/>
+          <w:sz w:val="21"/>
+          <w:szCs w:val="21"/>
+        </w:rPr>
+        <w:t xml:space="preserve"> updating the Sprint 4 burndown each day from the actual Trello checklist count, given three members integrating into one shared codebase.</w:t>
       </w:r>
     </w:p>
     <w:p>
@@ -2211,7 +2265,25 @@
                 <w:sz w:val="18"/>
                 <w:szCs w:val="18"/>
               </w:rPr>
-              <w:t>Build closed Day 3; tooltip (daily units/revenue detail) and drag-to-zoom box-select closed Day 4 (Sprint 3 Burndown; Sprint 3 Backlog).</w:t>
+              <w:t xml:space="preserve">Build closed Day 3; tooltip (daily </w:t>
+            </w:r>
+            <w:proofErr w:type="gramStart"/>
+            <w:r>
+              <w:rPr>
+                <w:rFonts w:ascii="Calibri" w:eastAsia="Calibri" w:hAnsi="Calibri" w:cs="Calibri"/>
+                <w:sz w:val="18"/>
+                <w:szCs w:val="18"/>
+              </w:rPr>
+              <w:t>units</w:t>
+            </w:r>
+            <w:proofErr w:type="gramEnd"/>
+            <w:r>
+              <w:rPr>
+                <w:rFonts w:ascii="Calibri" w:eastAsia="Calibri" w:hAnsi="Calibri" w:cs="Calibri"/>
+                <w:sz w:val="18"/>
+                <w:szCs w:val="18"/>
+              </w:rPr>
+              <w:t>/revenue detail) and drag-to-zoom box-select closed Day 4 (Sprint 3 Burndown; Sprint 3 Backlog).</w:t>
             </w:r>
           </w:p>
         </w:tc>
@@ -3150,7 +3222,25 @@
                 <w:sz w:val="18"/>
                 <w:szCs w:val="18"/>
               </w:rPr>
-              <w:t xml:space="preserve"> = store location. Tooltip shows daily units/revenue detail; drag to zoom (box-select).</w:t>
+              <w:t xml:space="preserve"> = store location. Tooltip shows daily </w:t>
+            </w:r>
+            <w:proofErr w:type="gramStart"/>
+            <w:r>
+              <w:rPr>
+                <w:rFonts w:ascii="Calibri" w:eastAsia="Calibri" w:hAnsi="Calibri" w:cs="Calibri"/>
+                <w:sz w:val="18"/>
+                <w:szCs w:val="18"/>
+              </w:rPr>
+              <w:t>units</w:t>
+            </w:r>
+            <w:proofErr w:type="gramEnd"/>
+            <w:r>
+              <w:rPr>
+                <w:rFonts w:ascii="Calibri" w:eastAsia="Calibri" w:hAnsi="Calibri" w:cs="Calibri"/>
+                <w:sz w:val="18"/>
+                <w:szCs w:val="18"/>
+              </w:rPr>
+              <w:t>/revenue detail; drag to zoom (box-select).</w:t>
             </w:r>
           </w:p>
         </w:tc>
@@ -3406,7 +3496,16 @@
                 <w:sz w:val="18"/>
                 <w:szCs w:val="18"/>
               </w:rPr>
-              <w:t xml:space="preserve">Heat map </w:t>
+              <w:t xml:space="preserve">Heat </w:t>
+            </w:r>
+            <w:proofErr w:type="gramStart"/>
+            <w:r>
+              <w:rPr>
+                <w:rFonts w:ascii="Calibri" w:eastAsia="Calibri" w:hAnsi="Calibri" w:cs="Calibri"/>
+                <w:sz w:val="18"/>
+                <w:szCs w:val="18"/>
+              </w:rPr>
+              <w:t xml:space="preserve">map </w:t>
             </w:r>
             <w:r>
               <w:rPr>
@@ -3422,7 +3521,34 @@
                 <w:sz w:val="18"/>
                 <w:szCs w:val="18"/>
               </w:rPr>
-              <w:t>store map; scatter plot full-width below</w:t>
+              <w:t>store</w:t>
+            </w:r>
+            <w:proofErr w:type="gramEnd"/>
+            <w:r>
+              <w:rPr>
+                <w:rFonts w:ascii="Calibri" w:eastAsia="Calibri" w:hAnsi="Calibri" w:cs="Calibri"/>
+                <w:sz w:val="18"/>
+                <w:szCs w:val="18"/>
+              </w:rPr>
+              <w:t xml:space="preserve"> map; scatter plot </w:t>
+            </w:r>
+            <w:proofErr w:type="gramStart"/>
+            <w:r>
+              <w:rPr>
+                <w:rFonts w:ascii="Calibri" w:eastAsia="Calibri" w:hAnsi="Calibri" w:cs="Calibri"/>
+                <w:sz w:val="18"/>
+                <w:szCs w:val="18"/>
+              </w:rPr>
+              <w:t>full-width</w:t>
+            </w:r>
+            <w:proofErr w:type="gramEnd"/>
+            <w:r>
+              <w:rPr>
+                <w:rFonts w:ascii="Calibri" w:eastAsia="Calibri" w:hAnsi="Calibri" w:cs="Calibri"/>
+                <w:sz w:val="18"/>
+                <w:szCs w:val="18"/>
+              </w:rPr>
+              <w:t xml:space="preserve"> below</w:t>
             </w:r>
             <w:r>
               <w:rPr>
@@ -3849,7 +3975,43 @@
                 <w:sz w:val="18"/>
                 <w:szCs w:val="18"/>
               </w:rPr>
-              <w:t>The cream/espresso design carries over unchanged to the integrated dashboard in both the light and dark themes.</w:t>
+              <w:t xml:space="preserve">The cream/espresso design </w:t>
+            </w:r>
+            <w:proofErr w:type="gramStart"/>
+            <w:r>
+              <w:rPr>
+                <w:rFonts w:ascii="Calibri" w:eastAsia="Calibri" w:hAnsi="Calibri" w:cs="Calibri"/>
+                <w:sz w:val="18"/>
+                <w:szCs w:val="18"/>
+              </w:rPr>
+              <w:t>carries over</w:t>
+            </w:r>
+            <w:proofErr w:type="gramEnd"/>
+            <w:r>
+              <w:rPr>
+                <w:rFonts w:ascii="Calibri" w:eastAsia="Calibri" w:hAnsi="Calibri" w:cs="Calibri"/>
+                <w:sz w:val="18"/>
+                <w:szCs w:val="18"/>
+              </w:rPr>
+              <w:t xml:space="preserve"> unchanged to the integrated dashboard in both </w:t>
+            </w:r>
+            <w:proofErr w:type="gramStart"/>
+            <w:r>
+              <w:rPr>
+                <w:rFonts w:ascii="Calibri" w:eastAsia="Calibri" w:hAnsi="Calibri" w:cs="Calibri"/>
+                <w:sz w:val="18"/>
+                <w:szCs w:val="18"/>
+              </w:rPr>
+              <w:t>the light</w:t>
+            </w:r>
+            <w:proofErr w:type="gramEnd"/>
+            <w:r>
+              <w:rPr>
+                <w:rFonts w:ascii="Calibri" w:eastAsia="Calibri" w:hAnsi="Calibri" w:cs="Calibri"/>
+                <w:sz w:val="18"/>
+                <w:szCs w:val="18"/>
+              </w:rPr>
+              <w:t xml:space="preserve"> and dark themes.</w:t>
             </w:r>
           </w:p>
         </w:tc>
@@ -4214,13 +4376,23 @@
                 <w:szCs w:val="18"/>
               </w:rPr>
             </w:pPr>
-            <w:r>
-              <w:rPr>
-                <w:rFonts w:ascii="Calibri" w:eastAsia="Calibri" w:hAnsi="Calibri" w:cs="Calibri"/>
-                <w:sz w:val="18"/>
-                <w:szCs w:val="18"/>
-              </w:rPr>
-              <w:t>Integrate Chart 1 (S4-01)</w:t>
+            <w:proofErr w:type="gramStart"/>
+            <w:r>
+              <w:rPr>
+                <w:rFonts w:ascii="Calibri" w:eastAsia="Calibri" w:hAnsi="Calibri" w:cs="Calibri"/>
+                <w:sz w:val="18"/>
+                <w:szCs w:val="18"/>
+              </w:rPr>
+              <w:t>Integrate</w:t>
+            </w:r>
+            <w:proofErr w:type="gramEnd"/>
+            <w:r>
+              <w:rPr>
+                <w:rFonts w:ascii="Calibri" w:eastAsia="Calibri" w:hAnsi="Calibri" w:cs="Calibri"/>
+                <w:sz w:val="18"/>
+                <w:szCs w:val="18"/>
+              </w:rPr>
+              <w:t xml:space="preserve"> Chart 1 (S4-01)</w:t>
             </w:r>
           </w:p>
         </w:tc>
@@ -4290,15 +4462,33 @@
                 <w:sz w:val="18"/>
                 <w:szCs w:val="18"/>
               </w:rPr>
-              <w:t xml:space="preserve">D3.js Temporal Heat Map running </w:t>
-            </w:r>
-            <w:r>
-              <w:rPr>
-                <w:rFonts w:ascii="Calibri" w:eastAsia="Calibri" w:hAnsi="Calibri" w:cs="Calibri"/>
-                <w:sz w:val="18"/>
-                <w:szCs w:val="18"/>
-              </w:rPr>
-              <w:t xml:space="preserve"> full width </w:t>
+              <w:t xml:space="preserve">D3.js Temporal Heat Map </w:t>
+            </w:r>
+            <w:proofErr w:type="gramStart"/>
+            <w:r>
+              <w:rPr>
+                <w:rFonts w:ascii="Calibri" w:eastAsia="Calibri" w:hAnsi="Calibri" w:cs="Calibri"/>
+                <w:sz w:val="18"/>
+                <w:szCs w:val="18"/>
+              </w:rPr>
+              <w:t xml:space="preserve">running </w:t>
+            </w:r>
+            <w:r>
+              <w:rPr>
+                <w:rFonts w:ascii="Calibri" w:eastAsia="Calibri" w:hAnsi="Calibri" w:cs="Calibri"/>
+                <w:sz w:val="18"/>
+                <w:szCs w:val="18"/>
+              </w:rPr>
+              <w:t xml:space="preserve"> full</w:t>
+            </w:r>
+            <w:proofErr w:type="gramEnd"/>
+            <w:r>
+              <w:rPr>
+                <w:rFonts w:ascii="Calibri" w:eastAsia="Calibri" w:hAnsi="Calibri" w:cs="Calibri"/>
+                <w:sz w:val="18"/>
+                <w:szCs w:val="18"/>
+              </w:rPr>
+              <w:t xml:space="preserve"> width </w:t>
             </w:r>
             <w:r>
               <w:rPr>
@@ -4608,7 +4798,25 @@
                 <w:sz w:val="18"/>
                 <w:szCs w:val="18"/>
               </w:rPr>
-              <w:t>D3.js Scatter Plot running full-width inside the shared layout on the common dataset</w:t>
+              <w:t xml:space="preserve">D3.js Scatter Plot running </w:t>
+            </w:r>
+            <w:proofErr w:type="gramStart"/>
+            <w:r>
+              <w:rPr>
+                <w:rFonts w:ascii="Calibri" w:eastAsia="Calibri" w:hAnsi="Calibri" w:cs="Calibri"/>
+                <w:sz w:val="18"/>
+                <w:szCs w:val="18"/>
+              </w:rPr>
+              <w:t>full-width</w:t>
+            </w:r>
+            <w:proofErr w:type="gramEnd"/>
+            <w:r>
+              <w:rPr>
+                <w:rFonts w:ascii="Calibri" w:eastAsia="Calibri" w:hAnsi="Calibri" w:cs="Calibri"/>
+                <w:sz w:val="18"/>
+                <w:szCs w:val="18"/>
+              </w:rPr>
+              <w:t xml:space="preserve"> inside the shared layout on the common dataset</w:t>
             </w:r>
           </w:p>
         </w:tc>
@@ -6203,7 +6411,61 @@
           <w:sz w:val="21"/>
           <w:szCs w:val="21"/>
         </w:rPr>
-        <w:t>Chart ownership unchanged: Chart 1 (Temporal Heat Map) — Samarakoon; Chart 2 (Store Location Map) — Ilamperuma; Chart 3 (Scatter Plot) — De Silva.</w:t>
+        <w:t xml:space="preserve">Chart ownership unchanged: Chart 1 (Temporal Heat </w:t>
+      </w:r>
+      <w:proofErr w:type="gramStart"/>
+      <w:r>
+        <w:rPr>
+          <w:rFonts w:ascii="Calibri" w:hAnsi="Calibri" w:cs="Calibri"/>
+          <w:sz w:val="21"/>
+          <w:szCs w:val="21"/>
+        </w:rPr>
+        <w:t>Map) —</w:t>
+      </w:r>
+      <w:proofErr w:type="gramEnd"/>
+      <w:r>
+        <w:rPr>
+          <w:rFonts w:ascii="Calibri" w:hAnsi="Calibri" w:cs="Calibri"/>
+          <w:sz w:val="21"/>
+          <w:szCs w:val="21"/>
+        </w:rPr>
+        <w:t xml:space="preserve"> Samarakoon; Chart 2 (Store Location </w:t>
+      </w:r>
+      <w:proofErr w:type="gramStart"/>
+      <w:r>
+        <w:rPr>
+          <w:rFonts w:ascii="Calibri" w:hAnsi="Calibri" w:cs="Calibri"/>
+          <w:sz w:val="21"/>
+          <w:szCs w:val="21"/>
+        </w:rPr>
+        <w:t>Map) —</w:t>
+      </w:r>
+      <w:proofErr w:type="gramEnd"/>
+      <w:r>
+        <w:rPr>
+          <w:rFonts w:ascii="Calibri" w:hAnsi="Calibri" w:cs="Calibri"/>
+          <w:sz w:val="21"/>
+          <w:szCs w:val="21"/>
+        </w:rPr>
+        <w:t xml:space="preserve"> Ilamperuma; Chart 3 (Scatter </w:t>
+      </w:r>
+      <w:proofErr w:type="gramStart"/>
+      <w:r>
+        <w:rPr>
+          <w:rFonts w:ascii="Calibri" w:hAnsi="Calibri" w:cs="Calibri"/>
+          <w:sz w:val="21"/>
+          <w:szCs w:val="21"/>
+        </w:rPr>
+        <w:t>Plot) —</w:t>
+      </w:r>
+      <w:proofErr w:type="gramEnd"/>
+      <w:r>
+        <w:rPr>
+          <w:rFonts w:ascii="Calibri" w:hAnsi="Calibri" w:cs="Calibri"/>
+          <w:sz w:val="21"/>
+          <w:szCs w:val="21"/>
+        </w:rPr>
+        <w:t xml:space="preserve"> De Silva.</w:t>
       </w:r>
     </w:p>
     <w:p>
@@ -6267,6 +6529,7 @@
         </w:rPr>
         <w:t xml:space="preserve">The integrated dashboard follows the confirmed layout and </w:t>
       </w:r>
+      <w:proofErr w:type="gramStart"/>
       <w:r>
         <w:rPr>
           <w:rFonts w:ascii="Calibri" w:hAnsi="Calibri" w:cs="Calibri"/>
@@ -6275,6 +6538,7 @@
         </w:rPr>
         <w:t>finalized</w:t>
       </w:r>
+      <w:proofErr w:type="gramEnd"/>
       <w:r>
         <w:rPr>
           <w:rFonts w:ascii="Calibri" w:hAnsi="Calibri" w:cs="Calibri"/>
@@ -8209,7 +8473,25 @@
           <w:sz w:val="21"/>
           <w:szCs w:val="21"/>
         </w:rPr>
-        <w:t>Meeting 05 will review the integrated dashboard — shared filters, Reset button and connected charts — together with the Sprint 4 testing results and bug log, and begin planning the Sprint 5 final website checks: final UI review, ethical review (misleading axes, calculations, data-source attribution and limitations), documentation, and submission preparation.</w:t>
+        <w:t xml:space="preserve">Meeting 05 will review the integrated dashboard — shared filters, </w:t>
+      </w:r>
+      <w:proofErr w:type="gramStart"/>
+      <w:r>
+        <w:rPr>
+          <w:rFonts w:ascii="Calibri" w:hAnsi="Calibri" w:cs="Calibri"/>
+          <w:sz w:val="21"/>
+          <w:szCs w:val="21"/>
+        </w:rPr>
+        <w:t>Reset</w:t>
+      </w:r>
+      <w:proofErr w:type="gramEnd"/>
+      <w:r>
+        <w:rPr>
+          <w:rFonts w:ascii="Calibri" w:hAnsi="Calibri" w:cs="Calibri"/>
+          <w:sz w:val="21"/>
+          <w:szCs w:val="21"/>
+        </w:rPr>
+        <w:t xml:space="preserve"> button and connected charts — together with the Sprint 4 testing results and bug log, and begin planning the Sprint 5 final website checks: final UI review, ethical review (misleading axes, calculations, data-source attribution and limitations), documentation, and submission preparation.</w:t>
       </w:r>
     </w:p>
     <w:p>
@@ -8491,7 +8773,16 @@
           <w:sz w:val="20"/>
           <w:szCs w:val="20"/>
         </w:rPr>
-        <w:t>Chart 3 — Scatter Plot</w:t>
+        <w:t xml:space="preserve">Chart 3 — Scatter </w:t>
+      </w:r>
+      <w:proofErr w:type="gramStart"/>
+      <w:r>
+        <w:rPr>
+          <w:color w:val="000000" w:themeColor="text1"/>
+          <w:sz w:val="20"/>
+          <w:szCs w:val="20"/>
+        </w:rPr>
+        <w:t>Plot</w:t>
       </w:r>
       <w:r>
         <w:rPr>
@@ -8502,6 +8793,7 @@
         </w:rPr>
         <w:t>(</w:t>
       </w:r>
+      <w:proofErr w:type="gramEnd"/>
       <w:r>
         <w:rPr>
           <w:rFonts w:ascii="Calibri" w:eastAsia="Calibri" w:hAnsi="Calibri" w:cs="Calibri"/>
@@ -8761,49 +9053,87 @@
         <w:spacing w:after="80"/>
         <w:rPr>
           <w:rFonts w:ascii="Calibri" w:hAnsi="Calibri" w:cs="Calibri"/>
+          <w:sz w:val="21"/>
+          <w:szCs w:val="21"/>
         </w:rPr>
       </w:pPr>
-      <w:r>
-        <w:rPr>
-          <w:rFonts w:ascii="Calibri" w:hAnsi="Calibri" w:cs="Calibri"/>
-        </w:rPr>
-        <w:t xml:space="preserve">Initial </w:t>
-      </w:r>
-      <w:r>
-        <w:rPr>
-          <w:rFonts w:ascii="Calibri" w:hAnsi="Calibri" w:cs="Calibri"/>
-        </w:rPr>
-        <w:t>Dashboard</w:t>
-      </w:r>
-      <w:r>
-        <w:rPr>
-          <w:rFonts w:ascii="Calibri" w:hAnsi="Calibri" w:cs="Calibri"/>
-        </w:rPr>
-        <w:t xml:space="preserve"> - </w:t>
-      </w:r>
-      <w:hyperlink r:id="rId9" w:history="1">
-        <w:r>
-          <w:rPr>
-            <w:rStyle w:val="Hyperlink"/>
-            <w:rFonts w:ascii="Calibri" w:hAnsi="Calibri" w:cs="Calibri"/>
-          </w:rPr>
-          <w:t>Link</w:t>
-        </w:r>
-      </w:hyperlink>
     </w:p>
     <w:p>
       <w:pPr>
         <w:spacing w:after="80"/>
         <w:rPr>
+          <w:rStyle w:val="Hyperlink"/>
           <w:rFonts w:ascii="Calibri" w:hAnsi="Calibri" w:cs="Calibri"/>
         </w:rPr>
       </w:pPr>
       <w:r>
         <w:rPr>
           <w:rFonts w:ascii="Calibri" w:hAnsi="Calibri" w:cs="Calibri"/>
+        </w:rPr>
+        <w:lastRenderedPageBreak/>
+        <w:t xml:space="preserve">Initial </w:t>
+      </w:r>
+      <w:r>
+        <w:rPr>
+          <w:rFonts w:ascii="Calibri" w:hAnsi="Calibri" w:cs="Calibri"/>
+        </w:rPr>
+        <w:t>Dashboard</w:t>
+      </w:r>
+      <w:r>
+        <w:rPr>
+          <w:rFonts w:ascii="Calibri" w:hAnsi="Calibri" w:cs="Calibri"/>
+        </w:rPr>
+        <w:t xml:space="preserve"> - </w:t>
+      </w:r>
+      <w:r>
+        <w:rPr>
+          <w:rFonts w:ascii="Calibri" w:hAnsi="Calibri" w:cs="Calibri"/>
+        </w:rPr>
+        <w:fldChar w:fldCharType="begin"/>
+      </w:r>
+      <w:r>
+        <w:rPr>
+          <w:rFonts w:ascii="Calibri" w:hAnsi="Calibri" w:cs="Calibri"/>
+        </w:rPr>
+        <w:instrText>HYPERLINK "https://github.com/inkymello/group4-interactive-visualisation/tree/main/dashboard/initial%20dashboard"</w:instrText>
+      </w:r>
+      <w:r>
+        <w:rPr>
+          <w:rFonts w:ascii="Calibri" w:hAnsi="Calibri" w:cs="Calibri"/>
+        </w:rPr>
+      </w:r>
+      <w:r>
+        <w:rPr>
+          <w:rFonts w:ascii="Calibri" w:hAnsi="Calibri" w:cs="Calibri"/>
+        </w:rPr>
+        <w:fldChar w:fldCharType="separate"/>
+      </w:r>
+      <w:r>
+        <w:rPr>
+          <w:rStyle w:val="Hyperlink"/>
+          <w:rFonts w:ascii="Calibri" w:hAnsi="Calibri" w:cs="Calibri"/>
+        </w:rPr>
+        <w:t>Link</w:t>
+      </w:r>
+    </w:p>
+    <w:p>
+      <w:pPr>
+        <w:spacing w:after="80"/>
+        <w:rPr>
+          <w:rFonts w:ascii="Calibri" w:hAnsi="Calibri" w:cs="Calibri"/>
+        </w:rPr>
+      </w:pPr>
+      <w:r>
+        <w:rPr>
+          <w:rFonts w:ascii="Calibri" w:hAnsi="Calibri" w:cs="Calibri"/>
+        </w:rPr>
+        <w:fldChar w:fldCharType="end"/>
+      </w:r>
+      <w:r>
+        <w:rPr>
+          <w:rFonts w:ascii="Calibri" w:hAnsi="Calibri" w:cs="Calibri"/>
           <w:noProof/>
         </w:rPr>
-        <w:lastRenderedPageBreak/>
         <w:drawing>
           <wp:inline distT="0" distB="0" distL="0" distR="0" wp14:anchorId="61C3CE3F" wp14:editId="41C26558">
             <wp:extent cx="3291059" cy="7258050"/>
@@ -8820,7 +9150,7 @@
                     <pic:cNvPicPr/>
                   </pic:nvPicPr>
                   <pic:blipFill>
-                    <a:blip r:embed="rId10"/>
+                    <a:blip r:embed="rId9"/>
                     <a:stretch>
                       <a:fillRect/>
                     </a:stretch>

</xml_diff>